<commit_message>
v2 of proposal ideas (revision)
</commit_message>
<xml_diff>
--- a/Proposal 1.docx
+++ b/Proposal 1.docx
@@ -1,6 +1,6 @@
 
 <file path=word/document.xml><?xml version="1.0" encoding="utf-8"?>
-<w:document xmlns:wpc="http://schemas.microsoft.com/office/word/2010/wordprocessingCanvas" xmlns:cx="http://schemas.microsoft.com/office/drawing/2014/chartex" xmlns:cx1="http://schemas.microsoft.com/office/drawing/2015/9/8/chartex" xmlns:cx2="http://schemas.microsoft.com/office/drawing/2015/10/21/chartex" xmlns:cx3="http://schemas.microsoft.com/office/drawing/2016/5/9/chartex" xmlns:cx4="http://schemas.microsoft.com/office/drawing/2016/5/10/chartex" xmlns:cx5="http://schemas.microsoft.com/office/drawing/2016/5/11/chartex" xmlns:cx6="http://schemas.microsoft.com/office/drawing/2016/5/12/chartex" xmlns:cx7="http://schemas.microsoft.com/office/drawing/2016/5/13/chartex" xmlns:cx8="http://schemas.microsoft.com/office/drawing/2016/5/14/chartex" xmlns:mc="http://schemas.openxmlformats.org/markup-compatibility/2006" xmlns:aink="http://schemas.microsoft.com/office/drawing/2016/ink" xmlns:am3d="http://schemas.microsoft.com/office/drawing/2017/model3d" xmlns:o="urn:schemas-microsoft-com:office:office" xmlns:r="http://schemas.openxmlformats.org/officeDocument/2006/relationships" xmlns:m="http://schemas.openxmlformats.org/officeDocument/2006/math" xmlns:v="urn:schemas-microsoft-com:vml" xmlns:wp14="http://schemas.microsoft.com/office/word/2010/wordprocessingDrawing" xmlns:wp="http://schemas.openxmlformats.org/drawingml/2006/wordprocessingDrawing" xmlns:w10="urn:schemas-microsoft-com:office:word" xmlns:w="http://schemas.openxmlformats.org/wordprocessingml/2006/main" xmlns:w14="http://schemas.microsoft.com/office/word/2010/wordml" xmlns:w15="http://schemas.microsoft.com/office/word/2012/wordml" xmlns:w16cid="http://schemas.microsoft.com/office/word/2016/wordml/cid" xmlns:w16se="http://schemas.microsoft.com/office/word/2015/wordml/symex" xmlns:wpg="http://schemas.microsoft.com/office/word/2010/wordprocessingGroup" xmlns:wpi="http://schemas.microsoft.com/office/word/2010/wordprocessingInk" xmlns:wne="http://schemas.microsoft.com/office/word/2006/wordml" xmlns:wps="http://schemas.microsoft.com/office/word/2010/wordprocessingShape" mc:Ignorable="w14 w15 w16se w16cid wp14">
+<w:document xmlns:wpc="http://schemas.microsoft.com/office/word/2010/wordprocessingCanvas" xmlns:cx="http://schemas.microsoft.com/office/drawing/2014/chartex" xmlns:cx1="http://schemas.microsoft.com/office/drawing/2015/9/8/chartex" xmlns:cx2="http://schemas.microsoft.com/office/drawing/2015/10/21/chartex" xmlns:cx3="http://schemas.microsoft.com/office/drawing/2016/5/9/chartex" xmlns:cx4="http://schemas.microsoft.com/office/drawing/2016/5/10/chartex" xmlns:cx5="http://schemas.microsoft.com/office/drawing/2016/5/11/chartex" xmlns:cx6="http://schemas.microsoft.com/office/drawing/2016/5/12/chartex" xmlns:cx7="http://schemas.microsoft.com/office/drawing/2016/5/13/chartex" xmlns:cx8="http://schemas.microsoft.com/office/drawing/2016/5/14/chartex" xmlns:mc="http://schemas.openxmlformats.org/markup-compatibility/2006" xmlns:aink="http://schemas.microsoft.com/office/drawing/2016/ink" xmlns:am3d="http://schemas.microsoft.com/office/drawing/2017/model3d" xmlns:o="urn:schemas-microsoft-com:office:office" xmlns:oel="http://schemas.microsoft.com/office/2019/extlst" xmlns:r="http://schemas.openxmlformats.org/officeDocument/2006/relationships" xmlns:m="http://schemas.openxmlformats.org/officeDocument/2006/math" xmlns:v="urn:schemas-microsoft-com:vml" xmlns:wp14="http://schemas.microsoft.com/office/word/2010/wordprocessingDrawing" xmlns:wp="http://schemas.openxmlformats.org/drawingml/2006/wordprocessingDrawing" xmlns:w10="urn:schemas-microsoft-com:office:word" xmlns:w="http://schemas.openxmlformats.org/wordprocessingml/2006/main" xmlns:w14="http://schemas.microsoft.com/office/word/2010/wordml" xmlns:w15="http://schemas.microsoft.com/office/word/2012/wordml" xmlns:w16cex="http://schemas.microsoft.com/office/word/2018/wordml/cex" xmlns:w16cid="http://schemas.microsoft.com/office/word/2016/wordml/cid" xmlns:w16="http://schemas.microsoft.com/office/word/2018/wordml" xmlns:w16du="http://schemas.microsoft.com/office/word/2023/wordml/word16du" xmlns:w16sdtdh="http://schemas.microsoft.com/office/word/2020/wordml/sdtdatahash" xmlns:w16sdtfl="http://schemas.microsoft.com/office/word/2024/wordml/sdtformatlock" xmlns:w16se="http://schemas.microsoft.com/office/word/2015/wordml/symex" xmlns:wpg="http://schemas.microsoft.com/office/word/2010/wordprocessingGroup" xmlns:wpi="http://schemas.microsoft.com/office/word/2010/wordprocessingInk" xmlns:wne="http://schemas.microsoft.com/office/word/2006/wordml" xmlns:wps="http://schemas.microsoft.com/office/word/2010/wordprocessingShape" mc:Ignorable="w14 w15 w16se w16cid w16 w16cex w16sdtdh w16sdtfl w16du wp14">
   <w:body>
     <w:p>
       <w:pPr>
@@ -34,7 +34,7 @@
           <w:noProof/>
         </w:rPr>
         <w:drawing>
-          <wp:anchor distT="0" distB="0" distL="114300" distR="114300" simplePos="0" relativeHeight="251658240" behindDoc="0" locked="0" layoutInCell="1" hidden="0" allowOverlap="1">
+          <wp:anchor distT="0" distB="0" distL="114300" distR="114300" simplePos="0" relativeHeight="251658240" behindDoc="0" locked="0" layoutInCell="1" hidden="0" allowOverlap="1" wp14:anchorId="73E08D67" wp14:editId="089DA387">
             <wp:simplePos x="0" y="0"/>
             <wp:positionH relativeFrom="column">
               <wp:posOffset>6124471</wp:posOffset>
@@ -82,7 +82,7 @@
           <w:noProof/>
         </w:rPr>
         <w:drawing>
-          <wp:anchor distT="0" distB="0" distL="114300" distR="114300" simplePos="0" relativeHeight="251659264" behindDoc="0" locked="0" layoutInCell="1" hidden="0" allowOverlap="1">
+          <wp:anchor distT="0" distB="0" distL="114300" distR="114300" simplePos="0" relativeHeight="251659264" behindDoc="0" locked="0" layoutInCell="1" hidden="0" allowOverlap="1" wp14:anchorId="2297364E" wp14:editId="1E0B1406">
             <wp:simplePos x="0" y="0"/>
             <wp:positionH relativeFrom="column">
               <wp:posOffset>1</wp:posOffset>
@@ -179,27 +179,7 @@
           <w:sz w:val="18"/>
           <w:szCs w:val="18"/>
         </w:rPr>
-        <w:t xml:space="preserve">Quadricentennial Campus, Colon Street, Barangay </w:t>
-      </w:r>
-      <w:proofErr w:type="spellStart"/>
-      <w:r>
-        <w:rPr>
-          <w:rFonts w:ascii="Arial" w:eastAsia="Arial" w:hAnsi="Arial" w:cs="Arial"/>
-          <w:color w:val="000000"/>
-          <w:sz w:val="18"/>
-          <w:szCs w:val="18"/>
-        </w:rPr>
-        <w:t>Pahina</w:t>
-      </w:r>
-      <w:proofErr w:type="spellEnd"/>
-      <w:r>
-        <w:rPr>
-          <w:rFonts w:ascii="Arial" w:eastAsia="Arial" w:hAnsi="Arial" w:cs="Arial"/>
-          <w:color w:val="000000"/>
-          <w:sz w:val="18"/>
-          <w:szCs w:val="18"/>
-        </w:rPr>
-        <w:t xml:space="preserve"> Central, Cebu City</w:t>
+        <w:t>Quadricentennial Campus, Colon Street, Barangay Pahina Central, Cebu City</w:t>
       </w:r>
     </w:p>
     <w:p>
@@ -275,7 +255,7 @@
         <mc:AlternateContent>
           <mc:Choice Requires="wps">
             <w:drawing>
-              <wp:anchor distT="45720" distB="45720" distL="114300" distR="114300" simplePos="0" relativeHeight="251660288" behindDoc="0" locked="0" layoutInCell="1" hidden="0" allowOverlap="1">
+              <wp:anchor distT="45720" distB="45720" distL="114300" distR="114300" simplePos="0" relativeHeight="251660288" behindDoc="0" locked="0" layoutInCell="1" hidden="0" allowOverlap="1" wp14:anchorId="2A0BDACF" wp14:editId="23D60C9F">
                 <wp:simplePos x="0" y="0"/>
                 <wp:positionH relativeFrom="column">
                   <wp:posOffset>14289</wp:posOffset>
@@ -359,7 +339,7 @@
           </mc:Choice>
           <mc:Fallback>
             <w:pict>
-              <v:rect id="Rectangle 1" o:spid="_x0000_s1026" style="position:absolute;left:0;text-align:left;margin-left:1.15pt;margin-top:25.45pt;width:539.25pt;height:52.45pt;z-index:251660288;visibility:visible;mso-wrap-style:square;mso-wrap-distance-left:9pt;mso-wrap-distance-top:3.6pt;mso-wrap-distance-right:9pt;mso-wrap-distance-bottom:3.6pt;mso-position-horizontal:absolute;mso-position-horizontal-relative:text;mso-position-vertical:absolute;mso-position-vertical-relative:text;v-text-anchor:top" o:gfxdata="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">
+              <v:rect w14:anchorId="2A0BDACF" id="Rectangle 1" o:spid="_x0000_s1026" style="position:absolute;left:0;text-align:left;margin-left:1.15pt;margin-top:25.45pt;width:539.25pt;height:52.45pt;z-index:251660288;visibility:visible;mso-wrap-style:square;mso-wrap-distance-left:9pt;mso-wrap-distance-top:3.6pt;mso-wrap-distance-right:9pt;mso-wrap-distance-bottom:3.6pt;mso-position-horizontal:absolute;mso-position-horizontal-relative:text;mso-position-vertical:absolute;mso-position-vertical-relative:text;v-text-anchor:top" o:gfxdata="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">
                 <v:stroke startarrowwidth="narrow" startarrowlength="short" endarrowwidth="narrow" endarrowlength="short" miterlimit="5243f"/>
                 <v:textbox inset="2.53958mm,1.2694mm,2.53958mm,1.2694mm">
                   <w:txbxContent>
@@ -543,19 +523,11 @@
                 <w:color w:val="000000"/>
               </w:rPr>
             </w:pPr>
-            <w:proofErr w:type="spellStart"/>
-            <w:r>
-              <w:rPr>
-                <w:rFonts w:ascii="Arial" w:eastAsia="Arial" w:hAnsi="Arial" w:cs="Arial"/>
-              </w:rPr>
-              <w:t>Aratia</w:t>
-            </w:r>
-            <w:proofErr w:type="spellEnd"/>
-            <w:r>
-              <w:rPr>
-                <w:rFonts w:ascii="Arial" w:eastAsia="Arial" w:hAnsi="Arial" w:cs="Arial"/>
-              </w:rPr>
-              <w:t>, Brian Joseph B.</w:t>
+            <w:r>
+              <w:rPr>
+                <w:rFonts w:ascii="Arial" w:eastAsia="Arial" w:hAnsi="Arial" w:cs="Arial"/>
+              </w:rPr>
+              <w:t>Aratia, Brian Joseph B.</w:t>
             </w:r>
           </w:p>
         </w:tc>
@@ -587,15 +559,6 @@
                 <w:color w:val="000000"/>
               </w:rPr>
             </w:pPr>
-            <w:r>
-              <w:rPr>
-                <w:rFonts w:ascii="Arial" w:eastAsia="Arial" w:hAnsi="Arial" w:cs="Arial"/>
-                <w:color w:val="000000"/>
-              </w:rPr>
-              <w:t>sssss</w:t>
-            </w:r>
-            <w:bookmarkStart w:id="0" w:name="_GoBack"/>
-            <w:bookmarkEnd w:id="0"/>
           </w:p>
         </w:tc>
       </w:tr>
@@ -1044,7 +1007,7 @@
                 <w:sz w:val="24"/>
                 <w:szCs w:val="24"/>
               </w:rPr>
-              <w:t>DALAN is a mobile application built with Flutter that helps Metro Cebu drivers make smarter, data-driven decisions about when to leave and which route to take — based not just on speed but on fuel cost, carbon emissions, and real Philippine road conditions</w:t>
+              <w:t>DALAN is a mobile application built with Flutter that helps Metro Cebu drivers make smarter, data-driven decisions about when to leave and which route to take</w:t>
             </w:r>
             <w:r>
               <w:rPr>
@@ -1052,7 +1015,7 @@
                 <w:sz w:val="24"/>
                 <w:szCs w:val="24"/>
               </w:rPr>
-              <w:t>. Unlike Google Maps and Waze which only reroute around traffic reactively, DALAN proactively calculates whether waiting a few minutes before departing would actually save the driver time and money. It personalizes all calculations to the user's specific v</w:t>
+              <w:t>,</w:t>
             </w:r>
             <w:r>
               <w:rPr>
@@ -1060,15 +1023,7 @@
                 <w:sz w:val="24"/>
                 <w:szCs w:val="24"/>
               </w:rPr>
-              <w:t>ehicle profile and uses live DOE fuel prices so every peso estimate reflects actual Philippine pump prices. It also layers in Cebu-specific hazards like CITOM number coding, flood-prone zones, and DENR air quality advisories that no global navigation app p</w:t>
-            </w:r>
-            <w:r>
-              <w:rPr>
-                <w:rFonts w:ascii="Arial" w:eastAsia="Arial" w:hAnsi="Arial" w:cs="Arial"/>
-                <w:sz w:val="24"/>
-                <w:szCs w:val="24"/>
-              </w:rPr>
-              <w:t xml:space="preserve">rovides. </w:t>
+              <w:t xml:space="preserve"> based not just on speed but on fuel cost, carbon emissions, and real Philippine road conditions. Unlike Google Maps and Waze which only reroute around traffic reactively, DALAN proactively calculates whether waiting a few minutes before departing would actually save the driver time and money. It personalizes all calculations to the user's specific vehicle profile and uses live DOE fuel prices so every peso estimate reflects actual Philippine pump prices. It also layers in Cebu-specific hazards like CITOM number coding, flood-prone zones, and DENR air quality advisories that no global navigation app provides. </w:t>
             </w:r>
           </w:p>
         </w:tc>
@@ -1197,21 +1152,7 @@
               <w:rPr>
                 <w:rFonts w:ascii="Arial" w:eastAsia="Arial" w:hAnsi="Arial" w:cs="Arial"/>
               </w:rPr>
-              <w:t xml:space="preserve">State Management - </w:t>
-            </w:r>
-            <w:proofErr w:type="spellStart"/>
-            <w:r>
-              <w:rPr>
-                <w:rFonts w:ascii="Arial" w:eastAsia="Arial" w:hAnsi="Arial" w:cs="Arial"/>
-              </w:rPr>
-              <w:t>Riverpod</w:t>
-            </w:r>
-            <w:proofErr w:type="spellEnd"/>
-            <w:r>
-              <w:rPr>
-                <w:rFonts w:ascii="Arial" w:eastAsia="Arial" w:hAnsi="Arial" w:cs="Arial"/>
-              </w:rPr>
-              <w:t xml:space="preserve"> </w:t>
+              <w:t xml:space="preserve">State Management - Riverpod </w:t>
             </w:r>
           </w:p>
           <w:p>
@@ -1236,35 +1177,7 @@
               <w:rPr>
                 <w:rFonts w:ascii="Arial" w:eastAsia="Arial" w:hAnsi="Arial" w:cs="Arial"/>
               </w:rPr>
-              <w:t xml:space="preserve">Maps &amp; Routing - </w:t>
-            </w:r>
-            <w:proofErr w:type="spellStart"/>
-            <w:r>
-              <w:rPr>
-                <w:rFonts w:ascii="Arial" w:eastAsia="Arial" w:hAnsi="Arial" w:cs="Arial"/>
-              </w:rPr>
-              <w:t>Mapbox</w:t>
-            </w:r>
-            <w:proofErr w:type="spellEnd"/>
-            <w:r>
-              <w:rPr>
-                <w:rFonts w:ascii="Arial" w:eastAsia="Arial" w:hAnsi="Arial" w:cs="Arial"/>
-              </w:rPr>
-              <w:t xml:space="preserve"> Directions API, </w:t>
-            </w:r>
-            <w:proofErr w:type="spellStart"/>
-            <w:r>
-              <w:rPr>
-                <w:rFonts w:ascii="Arial" w:eastAsia="Arial" w:hAnsi="Arial" w:cs="Arial"/>
-              </w:rPr>
-              <w:t>Mapbox</w:t>
-            </w:r>
-            <w:proofErr w:type="spellEnd"/>
-            <w:r>
-              <w:rPr>
-                <w:rFonts w:ascii="Arial" w:eastAsia="Arial" w:hAnsi="Arial" w:cs="Arial"/>
-              </w:rPr>
-              <w:t xml:space="preserve"> Geocoding API</w:t>
+              <w:t>Maps &amp; Routing - Mapbox Directions API, Mapbox Geocoding API</w:t>
             </w:r>
           </w:p>
           <w:p>
@@ -1289,21 +1202,7 @@
               <w:rPr>
                 <w:rFonts w:ascii="Arial" w:eastAsia="Arial" w:hAnsi="Arial" w:cs="Arial"/>
               </w:rPr>
-              <w:t xml:space="preserve">Backend - Firebase Auth, </w:t>
-            </w:r>
-            <w:proofErr w:type="spellStart"/>
-            <w:r>
-              <w:rPr>
-                <w:rFonts w:ascii="Arial" w:eastAsia="Arial" w:hAnsi="Arial" w:cs="Arial"/>
-              </w:rPr>
-              <w:t>Firestore</w:t>
-            </w:r>
-            <w:proofErr w:type="spellEnd"/>
-            <w:r>
-              <w:rPr>
-                <w:rFonts w:ascii="Arial" w:eastAsia="Arial" w:hAnsi="Arial" w:cs="Arial"/>
-              </w:rPr>
-              <w:t>, Cloud Functions (Node.js)</w:t>
+              <w:t>Backend - Firebase Auth, Firestore, Cloud Functions (Node.js)</w:t>
             </w:r>
           </w:p>
         </w:tc>
@@ -1653,6 +1552,13 @@
                 <w:color w:val="000000"/>
               </w:rPr>
             </w:pPr>
+            <w:r>
+              <w:rPr>
+                <w:rFonts w:ascii="Arial" w:eastAsia="Arial" w:hAnsi="Arial" w:cs="Arial"/>
+                <w:color w:val="000000"/>
+              </w:rPr>
+              <w:t>Engr. Violdan Bayocot</w:t>
+            </w:r>
           </w:p>
         </w:tc>
         <w:tc>
@@ -1673,6 +1579,13 @@
                 <w:color w:val="000000"/>
               </w:rPr>
             </w:pPr>
+            <w:r>
+              <w:rPr>
+                <w:rFonts w:ascii="Arial" w:eastAsia="Arial" w:hAnsi="Arial" w:cs="Arial"/>
+                <w:color w:val="000000"/>
+              </w:rPr>
+              <w:t>Engr. Alyssa Joyce Tan</w:t>
+            </w:r>
           </w:p>
         </w:tc>
         <w:tc>
@@ -1779,11 +1692,11 @@
 </file>
 
 <file path=word/numbering.xml><?xml version="1.0" encoding="utf-8"?>
-<w:numbering xmlns:wpc="http://schemas.microsoft.com/office/word/2010/wordprocessingCanvas" xmlns:cx="http://schemas.microsoft.com/office/drawing/2014/chartex" xmlns:cx1="http://schemas.microsoft.com/office/drawing/2015/9/8/chartex" xmlns:cx2="http://schemas.microsoft.com/office/drawing/2015/10/21/chartex" xmlns:cx3="http://schemas.microsoft.com/office/drawing/2016/5/9/chartex" xmlns:cx4="http://schemas.microsoft.com/office/drawing/2016/5/10/chartex" xmlns:cx5="http://schemas.microsoft.com/office/drawing/2016/5/11/chartex" xmlns:cx6="http://schemas.microsoft.com/office/drawing/2016/5/12/chartex" xmlns:cx7="http://schemas.microsoft.com/office/drawing/2016/5/13/chartex" xmlns:cx8="http://schemas.microsoft.com/office/drawing/2016/5/14/chartex" xmlns:mc="http://schemas.openxmlformats.org/markup-compatibility/2006" xmlns:aink="http://schemas.microsoft.com/office/drawing/2016/ink" xmlns:am3d="http://schemas.microsoft.com/office/drawing/2017/model3d" xmlns:o="urn:schemas-microsoft-com:office:office" xmlns:r="http://schemas.openxmlformats.org/officeDocument/2006/relationships" xmlns:m="http://schemas.openxmlformats.org/officeDocument/2006/math" xmlns:v="urn:schemas-microsoft-com:vml" xmlns:wp14="http://schemas.microsoft.com/office/word/2010/wordprocessingDrawing" xmlns:wp="http://schemas.openxmlformats.org/drawingml/2006/wordprocessingDrawing" xmlns:w10="urn:schemas-microsoft-com:office:word" xmlns:w="http://schemas.openxmlformats.org/wordprocessingml/2006/main" xmlns:w14="http://schemas.microsoft.com/office/word/2010/wordml" xmlns:w15="http://schemas.microsoft.com/office/word/2012/wordml" xmlns:w16cid="http://schemas.microsoft.com/office/word/2016/wordml/cid" xmlns:w16se="http://schemas.microsoft.com/office/word/2015/wordml/symex" xmlns:wpg="http://schemas.microsoft.com/office/word/2010/wordprocessingGroup" xmlns:wpi="http://schemas.microsoft.com/office/word/2010/wordprocessingInk" xmlns:wne="http://schemas.microsoft.com/office/word/2006/wordml" xmlns:wps="http://schemas.microsoft.com/office/word/2010/wordprocessingShape" mc:Ignorable="w14 w15 w16se w16cid wp14">
+<w:numbering xmlns:wpc="http://schemas.microsoft.com/office/word/2010/wordprocessingCanvas" xmlns:cx="http://schemas.microsoft.com/office/drawing/2014/chartex" xmlns:cx1="http://schemas.microsoft.com/office/drawing/2015/9/8/chartex" xmlns:cx2="http://schemas.microsoft.com/office/drawing/2015/10/21/chartex" xmlns:cx3="http://schemas.microsoft.com/office/drawing/2016/5/9/chartex" xmlns:cx4="http://schemas.microsoft.com/office/drawing/2016/5/10/chartex" xmlns:cx5="http://schemas.microsoft.com/office/drawing/2016/5/11/chartex" xmlns:cx6="http://schemas.microsoft.com/office/drawing/2016/5/12/chartex" xmlns:cx7="http://schemas.microsoft.com/office/drawing/2016/5/13/chartex" xmlns:cx8="http://schemas.microsoft.com/office/drawing/2016/5/14/chartex" xmlns:mc="http://schemas.openxmlformats.org/markup-compatibility/2006" xmlns:aink="http://schemas.microsoft.com/office/drawing/2016/ink" xmlns:am3d="http://schemas.microsoft.com/office/drawing/2017/model3d" xmlns:o="urn:schemas-microsoft-com:office:office" xmlns:oel="http://schemas.microsoft.com/office/2019/extlst" xmlns:r="http://schemas.openxmlformats.org/officeDocument/2006/relationships" xmlns:m="http://schemas.openxmlformats.org/officeDocument/2006/math" xmlns:v="urn:schemas-microsoft-com:vml" xmlns:wp14="http://schemas.microsoft.com/office/word/2010/wordprocessingDrawing" xmlns:wp="http://schemas.openxmlformats.org/drawingml/2006/wordprocessingDrawing" xmlns:w10="urn:schemas-microsoft-com:office:word" xmlns:w="http://schemas.openxmlformats.org/wordprocessingml/2006/main" xmlns:w14="http://schemas.microsoft.com/office/word/2010/wordml" xmlns:w15="http://schemas.microsoft.com/office/word/2012/wordml" xmlns:w16cex="http://schemas.microsoft.com/office/word/2018/wordml/cex" xmlns:w16cid="http://schemas.microsoft.com/office/word/2016/wordml/cid" xmlns:w16="http://schemas.microsoft.com/office/word/2018/wordml" xmlns:w16du="http://schemas.microsoft.com/office/word/2023/wordml/word16du" xmlns:w16sdtdh="http://schemas.microsoft.com/office/word/2020/wordml/sdtdatahash" xmlns:w16sdtfl="http://schemas.microsoft.com/office/word/2024/wordml/sdtformatlock" xmlns:w16se="http://schemas.microsoft.com/office/word/2015/wordml/symex" xmlns:wpg="http://schemas.microsoft.com/office/word/2010/wordprocessingGroup" xmlns:wpi="http://schemas.microsoft.com/office/word/2010/wordprocessingInk" xmlns:wne="http://schemas.microsoft.com/office/word/2006/wordml" xmlns:wps="http://schemas.microsoft.com/office/word/2010/wordprocessingShape" mc:Ignorable="w14 w15 w16se w16cid w16 w16cex w16sdtdh w16sdtfl w16du wp14">
   <w:abstractNum w:abstractNumId="0" w15:restartNumberingAfterBreak="0">
-    <w:nsid w:val="2AEA1530"/>
+    <w:nsid w:val="271B64F8"/>
     <w:multiLevelType w:val="multilevel"/>
-    <w:tmpl w:val="113A4B96"/>
+    <w:tmpl w:val="36D4B9AA"/>
     <w:lvl w:ilvl="0">
       <w:start w:val="1"/>
       <w:numFmt w:val="bullet"/>
@@ -1893,14 +1806,14 @@
       </w:rPr>
     </w:lvl>
   </w:abstractNum>
-  <w:num w:numId="1">
+  <w:num w:numId="1" w16cid:durableId="1362625929">
     <w:abstractNumId w:val="0"/>
   </w:num>
 </w:numbering>
 </file>
 
 <file path=word/styles.xml><?xml version="1.0" encoding="utf-8"?>
-<w:styles xmlns:mc="http://schemas.openxmlformats.org/markup-compatibility/2006" xmlns:r="http://schemas.openxmlformats.org/officeDocument/2006/relationships" xmlns:w="http://schemas.openxmlformats.org/wordprocessingml/2006/main" xmlns:w14="http://schemas.microsoft.com/office/word/2010/wordml" xmlns:w15="http://schemas.microsoft.com/office/word/2012/wordml" xmlns:w16cid="http://schemas.microsoft.com/office/word/2016/wordml/cid" xmlns:w16se="http://schemas.microsoft.com/office/word/2015/wordml/symex" mc:Ignorable="w14 w15 w16se w16cid">
+<w:styles xmlns:mc="http://schemas.openxmlformats.org/markup-compatibility/2006" xmlns:r="http://schemas.openxmlformats.org/officeDocument/2006/relationships" xmlns:w="http://schemas.openxmlformats.org/wordprocessingml/2006/main" xmlns:w14="http://schemas.microsoft.com/office/word/2010/wordml" xmlns:w15="http://schemas.microsoft.com/office/word/2012/wordml" xmlns:w16cex="http://schemas.microsoft.com/office/word/2018/wordml/cex" xmlns:w16cid="http://schemas.microsoft.com/office/word/2016/wordml/cid" xmlns:w16="http://schemas.microsoft.com/office/word/2018/wordml" xmlns:w16du="http://schemas.microsoft.com/office/word/2023/wordml/word16du" xmlns:w16sdtdh="http://schemas.microsoft.com/office/word/2020/wordml/sdtdatahash" xmlns:w16sdtfl="http://schemas.microsoft.com/office/word/2024/wordml/sdtformatlock" xmlns:w16se="http://schemas.microsoft.com/office/word/2015/wordml/symex" mc:Ignorable="w14 w15 w16se w16cid w16 w16cex w16sdtdh w16sdtfl w16du">
   <w:docDefaults>
     <w:rPrDefault>
       <w:rPr>
@@ -1916,7 +1829,7 @@
       </w:pPr>
     </w:pPrDefault>
   </w:docDefaults>
-  <w:latentStyles w:defLockedState="0" w:defUIPriority="99" w:defSemiHidden="0" w:defUnhideWhenUsed="0" w:defQFormat="0" w:count="375">
+  <w:latentStyles w:defLockedState="0" w:defUIPriority="99" w:defSemiHidden="0" w:defUnhideWhenUsed="0" w:defQFormat="0" w:count="376">
     <w:lsdException w:name="Normal" w:uiPriority="0" w:qFormat="1"/>
     <w:lsdException w:name="heading 1" w:uiPriority="9" w:qFormat="1"/>
     <w:lsdException w:name="heading 2" w:semiHidden="1" w:uiPriority="9" w:unhideWhenUsed="1" w:qFormat="1"/>
@@ -2292,6 +2205,7 @@
     <w:lsdException w:name="Smart Hyperlink" w:semiHidden="1" w:unhideWhenUsed="1"/>
     <w:lsdException w:name="Hashtag" w:semiHidden="1" w:unhideWhenUsed="1"/>
     <w:lsdException w:name="Unresolved Mention" w:semiHidden="1" w:unhideWhenUsed="1"/>
+    <w:lsdException w:name="Smart Link" w:semiHidden="1" w:unhideWhenUsed="1"/>
   </w:latentStyles>
   <w:style w:type="paragraph" w:default="1" w:styleId="Normal">
     <w:name w:val="Normal"/>

</xml_diff>